<commit_message>
update grade to 86: AI skill files kept as evidence, no deduction
Co-Authored-By: Claude Fable 5.1 <noreply@anthropic.com>
</commit_message>
<xml_diff>
--- a/feedback/Marc-Flores-Mendoza-Portfolio-Project-1-Feedback.docx
+++ b/feedback/Marc-Flores-Mendoza-Portfolio-Project-1-Feedback.docx
@@ -74,7 +74,7 @@
         </w:rPr>
         <w:t xml:space="preserve">Repo: </w:t>
       </w:r>
-      <w:hyperlink w:history="1" r:id="rIdninvlw3mr5vi322e6uv0p">
+      <w:hyperlink w:history="1" r:id="rIdcohs0p95auxrm6v-iquyb">
         <w:r>
           <w:rPr>
             <w:rStyle w:val="Hyperlink"/>
@@ -92,7 +92,7 @@
         </w:rPr>
         <w:t xml:space="preserve">Live: </w:t>
       </w:r>
-      <w:hyperlink w:history="1" r:id="rIddo2id2qhzspfrhmmgb25r">
+      <w:hyperlink w:history="1" r:id="rIdaorx3b8evuwejmcpezpfv">
         <w:r>
           <w:rPr>
             <w:rStyle w:val="Hyperlink"/>
@@ -120,7 +120,7 @@
           <w:sz w:val="40"/>
           <w:szCs w:val="40"/>
         </w:rPr>
-        <w:t xml:space="preserve">Grade: 84 / 100</w:t>
+        <w:t xml:space="preserve">Grade: 86 / 100</w:t>
       </w:r>
     </w:p>
     <w:tbl>
@@ -699,7 +699,7 @@
                 <w:b w:val="false"/>
                 <w:bCs w:val="false"/>
               </w:rPr>
-              <w:t xml:space="preserve">10</w:t>
+              <w:t xml:space="preserve">12</w:t>
             </w:r>
           </w:p>
         </w:tc>
@@ -722,7 +722,7 @@
                 <w:b w:val="false"/>
                 <w:bCs w:val="false"/>
               </w:rPr>
-              <w:t xml:space="preserve">README complete, 19 descriptive commits; 260 unrelated Claude skill files committed, all in one 13-hour window</w:t>
+              <w:t xml:space="preserve">README complete, 19 descriptive commits, AI skill files kept as evidence; all in one 13-hour window</w:t>
             </w:r>
           </w:p>
         </w:tc>
@@ -893,7 +893,7 @@
                 <w:b w:val="false"/>
                 <w:bCs w:val="false"/>
               </w:rPr>
-              <w:t xml:space="preserve">84</w:t>
+              <w:t xml:space="preserve">86</w:t>
             </w:r>
           </w:p>
         </w:tc>
@@ -916,7 +916,7 @@
                 <w:b w:val="false"/>
                 <w:bCs w:val="false"/>
               </w:rPr>
-              <w:t xml:space="preserve">The most complete site in the class. The repo and the form need the same care as the CSS.</w:t>
+              <w:t xml:space="preserve">The most complete site in the class. The form and the nav need the same care as the CSS.</w:t>
             </w:r>
           </w:p>
         </w:tc>
@@ -969,7 +969,7 @@
         <w:spacing w:after="120"/>
       </w:pPr>
       <w:r>
-        <w:t xml:space="preserve">The deductions are about the edges. The repo has 282 files and 22 of them are the site; the other 260 are Claude Code skill files that have nothing to do with the project. The contact form has no handler and no destination, so clicking Send reloads the page with the visitor's message in the address bar and nothing else happens, while the README calls it "a working form." The nav is placed after a 100vh hero, so on first paint nobody can see it. And all 19 commits are inside one 13-hour stretch on the due date, with the last seven timestamped after midnight.</w:t>
+        <w:t xml:space="preserve">The deductions are about the edges. The contact form has no handler and no destination, so clicking Send reloads the page with the visitor's message in the address bar and nothing else happens, while the README calls it "a working form." The nav is placed after a 100vh hero, so on first paint nobody can see it. And all 19 commits are inside one 13-hour stretch on the due date, with the last seven timestamped after midnight.</w:t>
       </w:r>
     </w:p>
     <w:p>
@@ -1665,7 +1665,7 @@
                 <w:b w:val="false"/>
                 <w:bCs w:val="false"/>
               </w:rPr>
-              <w:t xml:space="preserve">282; 260 are under .claude/skills/</w:t>
+              <w:t xml:space="preserve">282; 260 are under .claude/skills/, kept as a record of the AI tooling used (your instructor asked for that)</w:t>
             </w:r>
           </w:p>
         </w:tc>
@@ -2592,7 +2592,7 @@
         <w:spacing w:after="120" w:before="360"/>
       </w:pPr>
       <w:r>
-        <w:t xml:space="preserve">Repository and deployment: 10 / 15</w:t>
+        <w:t xml:space="preserve">Repository and deployment: 12 / 15</w:t>
       </w:r>
     </w:p>
     <w:p>
@@ -2647,10 +2647,10 @@
           <w:b/>
           <w:bCs/>
         </w:rPr>
-        <w:t xml:space="preserve">260 of the 282 files in the repo are not the site. </w:t>
-      </w:r>
-      <w:r>
-        <w:t xml:space="preserve">The first commit added .claude/skills/ with brand guidelines, slide templates, a design-system skill and their scripts: 260 files, none of which the site loads. They are tooling for your editor, not the project. Delete the folder and add .claude/ to .gitignore, the way node_modules/ already is.</w:t>
+        <w:t xml:space="preserve">The .claude/skills/ folder stays. </w:t>
+      </w:r>
+      <w:r>
+        <w:t xml:space="preserve">260 of the 282 files in the repo are Claude Code skill files. Normally that is editor tooling that does not belong in a project repo, but your instructor wants it kept as a record of what the AI was given to work with. No points off. Just know that on a job it would go in .gitignore next to node_modules/.</w:t>
       </w:r>
     </w:p>
     <w:p>
@@ -2827,7 +2827,7 @@
       <w:r>
         <w:drawing>
           <wp:inline distT="0" distB="0" distL="0" distR="0">
-            <wp:extent cx="5943600" cy="4000500"/>
+            <wp:extent cx="5943600" cy="3886200"/>
             <wp:effectExtent t="0" r="0" b="0" l="0"/>
             <wp:docPr id="1" name="" descr="" title=""/>
             <wp:cNvGraphicFramePr>
@@ -2852,7 +2852,7 @@
                   <pic:spPr bwMode="auto">
                     <a:xfrm>
                       <a:off x="0" y="0"/>
-                      <a:ext cx="5943600" cy="4000500"/>
+                      <a:ext cx="5943600" cy="3886200"/>
                     </a:xfrm>
                     <a:prstGeom prst="rect">
                       <a:avLst/>
@@ -2895,10 +2895,10 @@
           <w:b/>
           <w:bCs/>
         </w:rPr>
-        <w:t xml:space="preserve">Clean the repo. </w:t>
-      </w:r>
-      <w:r>
-        <w:t xml:space="preserve">Delete .claude/, add it to .gitignore, delete data.js. Ten minutes, and the repo goes from 282 files to 21.</w:t>
+        <w:t xml:space="preserve">Start Project 2 the day it is assigned. </w:t>
+      </w:r>
+      <w:r>
+        <w:t xml:space="preserve">Nineteen good commits in thirteen hours is still one night. Spread the same work over two weeks and the history tells a better story.</w:t>
       </w:r>
     </w:p>
     <w:p>

</xml_diff>